<commit_message>
Add table of contents to dossier and agenda slide to deck
- memoria: static TOC with dot leaders and page numbers (renders in
  both Word and the exported PDF)
- presentacion: new agenda slide after the title (10 slides total)

Co-Authored-By: Claude Fable 5 <noreply@anthropic.com>
Claude-Session: https://claude.ai/code/session_013BsgEy61L35bP2XPNZUhka
</commit_message>
<xml_diff>
--- a/docs/memoria-canvas-mcp.docx
+++ b/docs/memoria-canvas-mcp.docx
@@ -94,25 +94,634 @@
         <w:t xml:space="preserve">Índice</w:t>
       </w:r>
     </w:p>
-    <w:sdt>
-      <w:sdtPr>
-        <w:alias w:val="Índice"/>
-      </w:sdtPr>
-      <w:sdtContent>
-        <w:p>
-          <w:r>
-            <w:fldChar w:fldCharType="begin" w:dirty="true"/>
-            <w:instrText xml:space="preserve">TOC \h \o "1-2"</w:instrText>
-            <w:fldChar w:fldCharType="separate"/>
-          </w:r>
-        </w:p>
-        <w:p>
-          <w:r>
-            <w:fldChar w:fldCharType="end"/>
-          </w:r>
-        </w:p>
-      </w:sdtContent>
-    </w:sdt>
+    <w:p>
+      <w:pPr>
+        <w:tabs>
+          <w:tab w:val="right" w:pos="9026" w:leader="dot"/>
+        </w:tabs>
+        <w:spacing w:after="100" w:before="80"/>
+      </w:pPr>
+      <w:r>
+        <w:rPr>
+          <w:rFonts w:ascii="Calibri" w:cs="Calibri" w:eastAsia="Calibri" w:hAnsi="Calibri"/>
+          <w:b/>
+          <w:bCs/>
+          <w:color w:val="1F4E5F"/>
+          <w:sz w:val="22"/>
+          <w:szCs w:val="22"/>
+        </w:rPr>
+        <w:t xml:space="preserve">1. Introducción y motivación</w:t>
+      </w:r>
+      <w:r>
+        <w:rPr>
+          <w:rFonts w:ascii="Calibri" w:cs="Calibri" w:eastAsia="Calibri" w:hAnsi="Calibri"/>
+          <w:color w:val="000000"/>
+          <w:sz w:val="22"/>
+          <w:szCs w:val="22"/>
+        </w:rPr>
+        <w:t xml:space="preserve">	3</w:t>
+      </w:r>
+    </w:p>
+    <w:p>
+      <w:pPr>
+        <w:tabs>
+          <w:tab w:val="right" w:pos="9026" w:leader="dot"/>
+        </w:tabs>
+        <w:spacing w:after="100" w:before="80"/>
+      </w:pPr>
+      <w:r>
+        <w:rPr>
+          <w:rFonts w:ascii="Calibri" w:cs="Calibri" w:eastAsia="Calibri" w:hAnsi="Calibri"/>
+          <w:b/>
+          <w:bCs/>
+          <w:color w:val="1F4E5F"/>
+          <w:sz w:val="22"/>
+          <w:szCs w:val="22"/>
+        </w:rPr>
+        <w:t xml:space="preserve">2. Objetivos</w:t>
+      </w:r>
+      <w:r>
+        <w:rPr>
+          <w:rFonts w:ascii="Calibri" w:cs="Calibri" w:eastAsia="Calibri" w:hAnsi="Calibri"/>
+          <w:color w:val="000000"/>
+          <w:sz w:val="22"/>
+          <w:szCs w:val="22"/>
+        </w:rPr>
+        <w:t xml:space="preserve">	3</w:t>
+      </w:r>
+    </w:p>
+    <w:p>
+      <w:pPr>
+        <w:tabs>
+          <w:tab w:val="right" w:pos="9026" w:leader="dot"/>
+        </w:tabs>
+        <w:spacing w:after="100" w:before="80"/>
+      </w:pPr>
+      <w:r>
+        <w:rPr>
+          <w:rFonts w:ascii="Calibri" w:cs="Calibri" w:eastAsia="Calibri" w:hAnsi="Calibri"/>
+          <w:b/>
+          <w:bCs/>
+          <w:color w:val="1F4E5F"/>
+          <w:sz w:val="22"/>
+          <w:szCs w:val="22"/>
+        </w:rPr>
+        <w:t xml:space="preserve">3. Análisis</w:t>
+      </w:r>
+      <w:r>
+        <w:rPr>
+          <w:rFonts w:ascii="Calibri" w:cs="Calibri" w:eastAsia="Calibri" w:hAnsi="Calibri"/>
+          <w:color w:val="000000"/>
+          <w:sz w:val="22"/>
+          <w:szCs w:val="22"/>
+        </w:rPr>
+        <w:t xml:space="preserve">	3</w:t>
+      </w:r>
+    </w:p>
+    <w:p>
+      <w:pPr>
+        <w:tabs>
+          <w:tab w:val="right" w:pos="8606" w:leader="dot"/>
+        </w:tabs>
+        <w:spacing w:after="60" w:before="0"/>
+        <w:ind w:left="420"/>
+      </w:pPr>
+      <w:r>
+        <w:rPr>
+          <w:rFonts w:ascii="Calibri" w:cs="Calibri" w:eastAsia="Calibri" w:hAnsi="Calibri"/>
+          <w:b w:val="false"/>
+          <w:bCs w:val="false"/>
+          <w:color w:val="444444"/>
+          <w:sz w:val="20"/>
+          <w:szCs w:val="20"/>
+        </w:rPr>
+        <w:t xml:space="preserve">3.1. Requisitos funcionales</w:t>
+      </w:r>
+      <w:r>
+        <w:rPr>
+          <w:rFonts w:ascii="Calibri" w:cs="Calibri" w:eastAsia="Calibri" w:hAnsi="Calibri"/>
+          <w:color w:val="444444"/>
+          <w:sz w:val="20"/>
+          <w:szCs w:val="20"/>
+        </w:rPr>
+        <w:t xml:space="preserve">	3</w:t>
+      </w:r>
+    </w:p>
+    <w:p>
+      <w:pPr>
+        <w:tabs>
+          <w:tab w:val="right" w:pos="8606" w:leader="dot"/>
+        </w:tabs>
+        <w:spacing w:after="60" w:before="0"/>
+        <w:ind w:left="420"/>
+      </w:pPr>
+      <w:r>
+        <w:rPr>
+          <w:rFonts w:ascii="Calibri" w:cs="Calibri" w:eastAsia="Calibri" w:hAnsi="Calibri"/>
+          <w:b w:val="false"/>
+          <w:bCs w:val="false"/>
+          <w:color w:val="444444"/>
+          <w:sz w:val="20"/>
+          <w:szCs w:val="20"/>
+        </w:rPr>
+        <w:t xml:space="preserve">3.2. Requisitos no funcionales</w:t>
+      </w:r>
+      <w:r>
+        <w:rPr>
+          <w:rFonts w:ascii="Calibri" w:cs="Calibri" w:eastAsia="Calibri" w:hAnsi="Calibri"/>
+          <w:color w:val="444444"/>
+          <w:sz w:val="20"/>
+          <w:szCs w:val="20"/>
+        </w:rPr>
+        <w:t xml:space="preserve">	4</w:t>
+      </w:r>
+    </w:p>
+    <w:p>
+      <w:pPr>
+        <w:tabs>
+          <w:tab w:val="right" w:pos="9026" w:leader="dot"/>
+        </w:tabs>
+        <w:spacing w:after="100" w:before="80"/>
+      </w:pPr>
+      <w:r>
+        <w:rPr>
+          <w:rFonts w:ascii="Calibri" w:cs="Calibri" w:eastAsia="Calibri" w:hAnsi="Calibri"/>
+          <w:b/>
+          <w:bCs/>
+          <w:color w:val="1F4E5F"/>
+          <w:sz w:val="22"/>
+          <w:szCs w:val="22"/>
+        </w:rPr>
+        <w:t xml:space="preserve">4. Diseño y arquitectura</w:t>
+      </w:r>
+      <w:r>
+        <w:rPr>
+          <w:rFonts w:ascii="Calibri" w:cs="Calibri" w:eastAsia="Calibri" w:hAnsi="Calibri"/>
+          <w:color w:val="000000"/>
+          <w:sz w:val="22"/>
+          <w:szCs w:val="22"/>
+        </w:rPr>
+        <w:t xml:space="preserve">	4</w:t>
+      </w:r>
+    </w:p>
+    <w:p>
+      <w:pPr>
+        <w:tabs>
+          <w:tab w:val="right" w:pos="8606" w:leader="dot"/>
+        </w:tabs>
+        <w:spacing w:after="60" w:before="0"/>
+        <w:ind w:left="420"/>
+      </w:pPr>
+      <w:r>
+        <w:rPr>
+          <w:rFonts w:ascii="Calibri" w:cs="Calibri" w:eastAsia="Calibri" w:hAnsi="Calibri"/>
+          <w:b w:val="false"/>
+          <w:bCs w:val="false"/>
+          <w:color w:val="444444"/>
+          <w:sz w:val="20"/>
+          <w:szCs w:val="20"/>
+        </w:rPr>
+        <w:t xml:space="preserve">4.1. Decisiones de diseño</w:t>
+      </w:r>
+      <w:r>
+        <w:rPr>
+          <w:rFonts w:ascii="Calibri" w:cs="Calibri" w:eastAsia="Calibri" w:hAnsi="Calibri"/>
+          <w:color w:val="444444"/>
+          <w:sz w:val="20"/>
+          <w:szCs w:val="20"/>
+        </w:rPr>
+        <w:t xml:space="preserve">	4</w:t>
+      </w:r>
+    </w:p>
+    <w:p>
+      <w:pPr>
+        <w:tabs>
+          <w:tab w:val="right" w:pos="8606" w:leader="dot"/>
+        </w:tabs>
+        <w:spacing w:after="60" w:before="0"/>
+        <w:ind w:left="420"/>
+      </w:pPr>
+      <w:r>
+        <w:rPr>
+          <w:rFonts w:ascii="Calibri" w:cs="Calibri" w:eastAsia="Calibri" w:hAnsi="Calibri"/>
+          <w:b w:val="false"/>
+          <w:bCs w:val="false"/>
+          <w:color w:val="444444"/>
+          <w:sz w:val="20"/>
+          <w:szCs w:val="20"/>
+        </w:rPr>
+        <w:t xml:space="preserve">4.2. Estructura del proyecto</w:t>
+      </w:r>
+      <w:r>
+        <w:rPr>
+          <w:rFonts w:ascii="Calibri" w:cs="Calibri" w:eastAsia="Calibri" w:hAnsi="Calibri"/>
+          <w:color w:val="444444"/>
+          <w:sz w:val="20"/>
+          <w:szCs w:val="20"/>
+        </w:rPr>
+        <w:t xml:space="preserve">	5</w:t>
+      </w:r>
+    </w:p>
+    <w:p>
+      <w:pPr>
+        <w:tabs>
+          <w:tab w:val="right" w:pos="9026" w:leader="dot"/>
+        </w:tabs>
+        <w:spacing w:after="100" w:before="80"/>
+      </w:pPr>
+      <w:r>
+        <w:rPr>
+          <w:rFonts w:ascii="Calibri" w:cs="Calibri" w:eastAsia="Calibri" w:hAnsi="Calibri"/>
+          <w:b/>
+          <w:bCs/>
+          <w:color w:val="1F4E5F"/>
+          <w:sz w:val="22"/>
+          <w:szCs w:val="22"/>
+        </w:rPr>
+        <w:t xml:space="preserve">5. Implementación</w:t>
+      </w:r>
+      <w:r>
+        <w:rPr>
+          <w:rFonts w:ascii="Calibri" w:cs="Calibri" w:eastAsia="Calibri" w:hAnsi="Calibri"/>
+          <w:color w:val="000000"/>
+          <w:sz w:val="22"/>
+          <w:szCs w:val="22"/>
+        </w:rPr>
+        <w:t xml:space="preserve">	5</w:t>
+      </w:r>
+    </w:p>
+    <w:p>
+      <w:pPr>
+        <w:tabs>
+          <w:tab w:val="right" w:pos="8606" w:leader="dot"/>
+        </w:tabs>
+        <w:spacing w:after="60" w:before="0"/>
+        <w:ind w:left="420"/>
+      </w:pPr>
+      <w:r>
+        <w:rPr>
+          <w:rFonts w:ascii="Calibri" w:cs="Calibri" w:eastAsia="Calibri" w:hAnsi="Calibri"/>
+          <w:b w:val="false"/>
+          <w:bCs w:val="false"/>
+          <w:color w:val="444444"/>
+          <w:sz w:val="20"/>
+          <w:szCs w:val="20"/>
+        </w:rPr>
+        <w:t xml:space="preserve">5.1. Herramientas MCP expuestas</w:t>
+      </w:r>
+      <w:r>
+        <w:rPr>
+          <w:rFonts w:ascii="Calibri" w:cs="Calibri" w:eastAsia="Calibri" w:hAnsi="Calibri"/>
+          <w:color w:val="444444"/>
+          <w:sz w:val="20"/>
+          <w:szCs w:val="20"/>
+        </w:rPr>
+        <w:t xml:space="preserve">	5</w:t>
+      </w:r>
+    </w:p>
+    <w:p>
+      <w:pPr>
+        <w:tabs>
+          <w:tab w:val="right" w:pos="8606" w:leader="dot"/>
+        </w:tabs>
+        <w:spacing w:after="60" w:before="0"/>
+        <w:ind w:left="420"/>
+      </w:pPr>
+      <w:r>
+        <w:rPr>
+          <w:rFonts w:ascii="Calibri" w:cs="Calibri" w:eastAsia="Calibri" w:hAnsi="Calibri"/>
+          <w:b w:val="false"/>
+          <w:bCs w:val="false"/>
+          <w:color w:val="444444"/>
+          <w:sz w:val="20"/>
+          <w:szCs w:val="20"/>
+        </w:rPr>
+        <w:t xml:space="preserve">5.2. Paginación de la API</w:t>
+      </w:r>
+      <w:r>
+        <w:rPr>
+          <w:rFonts w:ascii="Calibri" w:cs="Calibri" w:eastAsia="Calibri" w:hAnsi="Calibri"/>
+          <w:color w:val="444444"/>
+          <w:sz w:val="20"/>
+          <w:szCs w:val="20"/>
+        </w:rPr>
+        <w:t xml:space="preserve">	5</w:t>
+      </w:r>
+    </w:p>
+    <w:p>
+      <w:pPr>
+        <w:tabs>
+          <w:tab w:val="right" w:pos="8606" w:leader="dot"/>
+        </w:tabs>
+        <w:spacing w:after="60" w:before="0"/>
+        <w:ind w:left="420"/>
+      </w:pPr>
+      <w:r>
+        <w:rPr>
+          <w:rFonts w:ascii="Calibri" w:cs="Calibri" w:eastAsia="Calibri" w:hAnsi="Calibri"/>
+          <w:b w:val="false"/>
+          <w:bCs w:val="false"/>
+          <w:color w:val="444444"/>
+          <w:sz w:val="20"/>
+          <w:szCs w:val="20"/>
+        </w:rPr>
+        <w:t xml:space="preserve">5.3. Configuración y credenciales</w:t>
+      </w:r>
+      <w:r>
+        <w:rPr>
+          <w:rFonts w:ascii="Calibri" w:cs="Calibri" w:eastAsia="Calibri" w:hAnsi="Calibri"/>
+          <w:color w:val="444444"/>
+          <w:sz w:val="20"/>
+          <w:szCs w:val="20"/>
+        </w:rPr>
+        <w:t xml:space="preserve">	5</w:t>
+      </w:r>
+    </w:p>
+    <w:p>
+      <w:pPr>
+        <w:tabs>
+          <w:tab w:val="right" w:pos="8606" w:leader="dot"/>
+        </w:tabs>
+        <w:spacing w:after="60" w:before="0"/>
+        <w:ind w:left="420"/>
+      </w:pPr>
+      <w:r>
+        <w:rPr>
+          <w:rFonts w:ascii="Calibri" w:cs="Calibri" w:eastAsia="Calibri" w:hAnsi="Calibri"/>
+          <w:b w:val="false"/>
+          <w:bCs w:val="false"/>
+          <w:color w:val="444444"/>
+          <w:sz w:val="20"/>
+          <w:szCs w:val="20"/>
+        </w:rPr>
+        <w:t xml:space="preserve">5.4. Volcado masivo (dump.py)</w:t>
+      </w:r>
+      <w:r>
+        <w:rPr>
+          <w:rFonts w:ascii="Calibri" w:cs="Calibri" w:eastAsia="Calibri" w:hAnsi="Calibri"/>
+          <w:color w:val="444444"/>
+          <w:sz w:val="20"/>
+          <w:szCs w:val="20"/>
+        </w:rPr>
+        <w:t xml:space="preserve">	6</w:t>
+      </w:r>
+    </w:p>
+    <w:p>
+      <w:pPr>
+        <w:tabs>
+          <w:tab w:val="right" w:pos="9026" w:leader="dot"/>
+        </w:tabs>
+        <w:spacing w:after="100" w:before="80"/>
+      </w:pPr>
+      <w:r>
+        <w:rPr>
+          <w:rFonts w:ascii="Calibri" w:cs="Calibri" w:eastAsia="Calibri" w:hAnsi="Calibri"/>
+          <w:b/>
+          <w:bCs/>
+          <w:color w:val="1F4E5F"/>
+          <w:sz w:val="22"/>
+          <w:szCs w:val="22"/>
+        </w:rPr>
+        <w:t xml:space="preserve">6. Pruebas y aseguramiento de la calidad</w:t>
+      </w:r>
+      <w:r>
+        <w:rPr>
+          <w:rFonts w:ascii="Calibri" w:cs="Calibri" w:eastAsia="Calibri" w:hAnsi="Calibri"/>
+          <w:color w:val="000000"/>
+          <w:sz w:val="22"/>
+          <w:szCs w:val="22"/>
+        </w:rPr>
+        <w:t xml:space="preserve">	6</w:t>
+      </w:r>
+    </w:p>
+    <w:p>
+      <w:pPr>
+        <w:tabs>
+          <w:tab w:val="right" w:pos="8606" w:leader="dot"/>
+        </w:tabs>
+        <w:spacing w:after="60" w:before="0"/>
+        <w:ind w:left="420"/>
+      </w:pPr>
+      <w:r>
+        <w:rPr>
+          <w:rFonts w:ascii="Calibri" w:cs="Calibri" w:eastAsia="Calibri" w:hAnsi="Calibri"/>
+          <w:b w:val="false"/>
+          <w:bCs w:val="false"/>
+          <w:color w:val="444444"/>
+          <w:sz w:val="20"/>
+          <w:szCs w:val="20"/>
+        </w:rPr>
+        <w:t xml:space="preserve">6.1. Estrategia de pruebas</w:t>
+      </w:r>
+      <w:r>
+        <w:rPr>
+          <w:rFonts w:ascii="Calibri" w:cs="Calibri" w:eastAsia="Calibri" w:hAnsi="Calibri"/>
+          <w:color w:val="444444"/>
+          <w:sz w:val="20"/>
+          <w:szCs w:val="20"/>
+        </w:rPr>
+        <w:t xml:space="preserve">	6</w:t>
+      </w:r>
+    </w:p>
+    <w:p>
+      <w:pPr>
+        <w:tabs>
+          <w:tab w:val="right" w:pos="8606" w:leader="dot"/>
+        </w:tabs>
+        <w:spacing w:after="60" w:before="0"/>
+        <w:ind w:left="420"/>
+      </w:pPr>
+      <w:r>
+        <w:rPr>
+          <w:rFonts w:ascii="Calibri" w:cs="Calibri" w:eastAsia="Calibri" w:hAnsi="Calibri"/>
+          <w:b w:val="false"/>
+          <w:bCs w:val="false"/>
+          <w:color w:val="444444"/>
+          <w:sz w:val="20"/>
+          <w:szCs w:val="20"/>
+        </w:rPr>
+        <w:t xml:space="preserve">6.2. Un error real encontrado por las pruebas</w:t>
+      </w:r>
+      <w:r>
+        <w:rPr>
+          <w:rFonts w:ascii="Calibri" w:cs="Calibri" w:eastAsia="Calibri" w:hAnsi="Calibri"/>
+          <w:color w:val="444444"/>
+          <w:sz w:val="20"/>
+          <w:szCs w:val="20"/>
+        </w:rPr>
+        <w:t xml:space="preserve">	6</w:t>
+      </w:r>
+    </w:p>
+    <w:p>
+      <w:pPr>
+        <w:tabs>
+          <w:tab w:val="right" w:pos="8606" w:leader="dot"/>
+        </w:tabs>
+        <w:spacing w:after="60" w:before="0"/>
+        <w:ind w:left="420"/>
+      </w:pPr>
+      <w:r>
+        <w:rPr>
+          <w:rFonts w:ascii="Calibri" w:cs="Calibri" w:eastAsia="Calibri" w:hAnsi="Calibri"/>
+          <w:b w:val="false"/>
+          <w:bCs w:val="false"/>
+          <w:color w:val="444444"/>
+          <w:sz w:val="20"/>
+          <w:szCs w:val="20"/>
+        </w:rPr>
+        <w:t xml:space="preserve">6.3. Análisis estático e integración continua</w:t>
+      </w:r>
+      <w:r>
+        <w:rPr>
+          <w:rFonts w:ascii="Calibri" w:cs="Calibri" w:eastAsia="Calibri" w:hAnsi="Calibri"/>
+          <w:color w:val="444444"/>
+          <w:sz w:val="20"/>
+          <w:szCs w:val="20"/>
+        </w:rPr>
+        <w:t xml:space="preserve">	6</w:t>
+      </w:r>
+    </w:p>
+    <w:p>
+      <w:pPr>
+        <w:tabs>
+          <w:tab w:val="right" w:pos="9026" w:leader="dot"/>
+        </w:tabs>
+        <w:spacing w:after="100" w:before="80"/>
+      </w:pPr>
+      <w:r>
+        <w:rPr>
+          <w:rFonts w:ascii="Calibri" w:cs="Calibri" w:eastAsia="Calibri" w:hAnsi="Calibri"/>
+          <w:b/>
+          <w:bCs/>
+          <w:color w:val="1F4E5F"/>
+          <w:sz w:val="22"/>
+          <w:szCs w:val="22"/>
+        </w:rPr>
+        <w:t xml:space="preserve">7. Distribución y despliegue</w:t>
+      </w:r>
+      <w:r>
+        <w:rPr>
+          <w:rFonts w:ascii="Calibri" w:cs="Calibri" w:eastAsia="Calibri" w:hAnsi="Calibri"/>
+          <w:color w:val="000000"/>
+          <w:sz w:val="22"/>
+          <w:szCs w:val="22"/>
+        </w:rPr>
+        <w:t xml:space="preserve">	7</w:t>
+      </w:r>
+    </w:p>
+    <w:p>
+      <w:pPr>
+        <w:tabs>
+          <w:tab w:val="right" w:pos="9026" w:leader="dot"/>
+        </w:tabs>
+        <w:spacing w:after="100" w:before="80"/>
+      </w:pPr>
+      <w:r>
+        <w:rPr>
+          <w:rFonts w:ascii="Calibri" w:cs="Calibri" w:eastAsia="Calibri" w:hAnsi="Calibri"/>
+          <w:b/>
+          <w:bCs/>
+          <w:color w:val="1F4E5F"/>
+          <w:sz w:val="22"/>
+          <w:szCs w:val="22"/>
+        </w:rPr>
+        <w:t xml:space="preserve">8. Seguridad y privacidad</w:t>
+      </w:r>
+      <w:r>
+        <w:rPr>
+          <w:rFonts w:ascii="Calibri" w:cs="Calibri" w:eastAsia="Calibri" w:hAnsi="Calibri"/>
+          <w:color w:val="000000"/>
+          <w:sz w:val="22"/>
+          <w:szCs w:val="22"/>
+        </w:rPr>
+        <w:t xml:space="preserve">	7</w:t>
+      </w:r>
+    </w:p>
+    <w:p>
+      <w:pPr>
+        <w:tabs>
+          <w:tab w:val="right" w:pos="9026" w:leader="dot"/>
+        </w:tabs>
+        <w:spacing w:after="100" w:before="80"/>
+      </w:pPr>
+      <w:r>
+        <w:rPr>
+          <w:rFonts w:ascii="Calibri" w:cs="Calibri" w:eastAsia="Calibri" w:hAnsi="Calibri"/>
+          <w:b/>
+          <w:bCs/>
+          <w:color w:val="1F4E5F"/>
+          <w:sz w:val="22"/>
+          <w:szCs w:val="22"/>
+        </w:rPr>
+        <w:t xml:space="preserve">9. Resultados y conclusiones</w:t>
+      </w:r>
+      <w:r>
+        <w:rPr>
+          <w:rFonts w:ascii="Calibri" w:cs="Calibri" w:eastAsia="Calibri" w:hAnsi="Calibri"/>
+          <w:color w:val="000000"/>
+          <w:sz w:val="22"/>
+          <w:szCs w:val="22"/>
+        </w:rPr>
+        <w:t xml:space="preserve">	7</w:t>
+      </w:r>
+    </w:p>
+    <w:p>
+      <w:pPr>
+        <w:tabs>
+          <w:tab w:val="right" w:pos="8606" w:leader="dot"/>
+        </w:tabs>
+        <w:spacing w:after="60" w:before="0"/>
+        <w:ind w:left="420"/>
+      </w:pPr>
+      <w:r>
+        <w:rPr>
+          <w:rFonts w:ascii="Calibri" w:cs="Calibri" w:eastAsia="Calibri" w:hAnsi="Calibri"/>
+          <w:b w:val="false"/>
+          <w:bCs w:val="false"/>
+          <w:color w:val="444444"/>
+          <w:sz w:val="20"/>
+          <w:szCs w:val="20"/>
+        </w:rPr>
+        <w:t xml:space="preserve">9.1. Posible interés para estudiantes y docencia</w:t>
+      </w:r>
+      <w:r>
+        <w:rPr>
+          <w:rFonts w:ascii="Calibri" w:cs="Calibri" w:eastAsia="Calibri" w:hAnsi="Calibri"/>
+          <w:color w:val="444444"/>
+          <w:sz w:val="20"/>
+          <w:szCs w:val="20"/>
+        </w:rPr>
+        <w:t xml:space="preserve">	7</w:t>
+      </w:r>
+    </w:p>
+    <w:p>
+      <w:pPr>
+        <w:tabs>
+          <w:tab w:val="right" w:pos="9026" w:leader="dot"/>
+        </w:tabs>
+        <w:spacing w:after="100" w:before="80"/>
+      </w:pPr>
+      <w:r>
+        <w:rPr>
+          <w:rFonts w:ascii="Calibri" w:cs="Calibri" w:eastAsia="Calibri" w:hAnsi="Calibri"/>
+          <w:b/>
+          <w:bCs/>
+          <w:color w:val="1F4E5F"/>
+          <w:sz w:val="22"/>
+          <w:szCs w:val="22"/>
+        </w:rPr>
+        <w:t xml:space="preserve">10. Trabajo futuro</w:t>
+      </w:r>
+      <w:r>
+        <w:rPr>
+          <w:rFonts w:ascii="Calibri" w:cs="Calibri" w:eastAsia="Calibri" w:hAnsi="Calibri"/>
+          <w:color w:val="000000"/>
+          <w:sz w:val="22"/>
+          <w:szCs w:val="22"/>
+        </w:rPr>
+        <w:t xml:space="preserve">	8</w:t>
+      </w:r>
+    </w:p>
     <w:p>
       <w:r>
         <w:br w:type="page"/>

</xml_diff>